<commit_message>
EHIS-3816 + Temp Food [Template changes]
</commit_message>
<xml_diff>
--- a/PHOCS-Docgentemplates/PHOCS Temp Food Premise Permit Template_v6.docx
+++ b/PHOCS-Docgentemplates/PHOCS Temp Food Premise Permit Template_v6.docx
@@ -1505,40 +1505,6 @@
         </w:tc>
       </w:tr>
     </w:tbl>
-    <w:p>
-      <w:pPr>
-        <w:divId w:val="910316353"/>
-        <w:rPr>
-          <w:rFonts w:ascii="Cambria" w:hAnsi="Cambria" w:cs="Times New Roman"/>
-        </w:rPr>
-      </w:pPr>
-    </w:p>
-    <w:p>
-      <w:pPr>
-        <w:divId w:val="1417825109"/>
-        <w:rPr>
-          <w:kern w:val="2"/>
-          <w:lang w:val="en-CA" w:eastAsia="en-CA"/>
-          <w14:ligatures w14:val="standardContextual"/>
-        </w:rPr>
-      </w:pPr>
-    </w:p>
-    <w:p>
-      <w:pPr>
-        <w:divId w:val="1417825109"/>
-        <w:rPr>
-          <w:rFonts w:ascii="Cambria" w:hAnsi="Cambria" w:cs="Times New Roman"/>
-        </w:rPr>
-      </w:pPr>
-    </w:p>
-    <w:p>
-      <w:pPr>
-        <w:divId w:val="1417825109"/>
-        <w:rPr>
-          <w:rFonts w:ascii="Cambria" w:hAnsi="Cambria" w:cs="Times New Roman"/>
-        </w:rPr>
-      </w:pPr>
-    </w:p>
     <w:p>
       <w:pPr>
         <w:rPr>
@@ -19303,30 +19269,6 @@
 </file>
 
 <file path=customXml/item1.xml><?xml version="1.0" encoding="utf-8"?>
-<?mso-contentType ?>
-<FormTemplates xmlns="http://schemas.microsoft.com/sharepoint/v3/contenttype/forms">
-  <Display>DocumentLibraryForm</Display>
-  <Edit>DocumentLibraryForm</Edit>
-  <New>DocumentLibraryForm</New>
-</FormTemplates>
-</file>
-
-<file path=customXml/item2.xml><?xml version="1.0" encoding="utf-8"?>
-<p:properties xmlns:p="http://schemas.microsoft.com/office/2006/metadata/properties" xmlns:xsi="http://www.w3.org/2001/XMLSchema-instance" xmlns:pc="http://schemas.microsoft.com/office/infopath/2007/PartnerControls">
-  <documentManagement>
-    <lcf76f155ced4ddcb4097134ff3c332f xmlns="94d5cf59-5162-48bc-aa9b-620df72947f5">
-      <Terms xmlns="http://schemas.microsoft.com/office/infopath/2007/PartnerControls"/>
-    </lcf76f155ced4ddcb4097134ff3c332f>
-    <TaxCatchAll xmlns="8350b7c0-334b-4e19-bfc1-744f6a979eee" xsi:nil="true"/>
-  </documentManagement>
-</p:properties>
-</file>
-
-<file path=customXml/item3.xml><?xml version="1.0" encoding="utf-8"?>
-<b:Sources xmlns:b="http://schemas.openxmlformats.org/officeDocument/2006/bibliography" xmlns="http://schemas.openxmlformats.org/officeDocument/2006/bibliography" SelectedStyle="/APA.XSL" StyleName="APA"/>
-</file>
-
-<file path=customXml/item4.xml><?xml version="1.0" encoding="utf-8"?>
 <ct:contentTypeSchema xmlns:ct="http://schemas.microsoft.com/office/2006/metadata/contentType" xmlns:ma="http://schemas.microsoft.com/office/2006/metadata/properties/metaAttributes" ct:_="" ma:_="" ma:contentTypeName="Document" ma:contentTypeID="0x01010015F16144C0593A4A82C8AE0B67DB460F" ma:contentTypeVersion="11" ma:contentTypeDescription="Create a new document." ma:contentTypeScope="" ma:versionID="f03428ffc1746d68619392bc270e65d0">
   <xsd:schema xmlns:xsd="http://www.w3.org/2001/XMLSchema" xmlns:xs="http://www.w3.org/2001/XMLSchema" xmlns:p="http://schemas.microsoft.com/office/2006/metadata/properties" xmlns:ns2="94d5cf59-5162-48bc-aa9b-620df72947f5" xmlns:ns3="8350b7c0-334b-4e19-bfc1-744f6a979eee" targetNamespace="http://schemas.microsoft.com/office/2006/metadata/properties" ma:root="true" ma:fieldsID="2206ae29c74f0be434f81d51f34f460d" ns2:_="" ns3:_="">
     <xsd:import namespace="94d5cf59-5162-48bc-aa9b-620df72947f5"/>
@@ -19521,34 +19463,31 @@
 </ct:contentTypeSchema>
 </file>
 
-<file path=customXml/itemProps1.xml><?xml version="1.0" encoding="utf-8"?>
-<ds:datastoreItem xmlns:ds="http://schemas.openxmlformats.org/officeDocument/2006/customXml" ds:itemID="{360ECE8A-3139-463D-90B6-2A7471686095}">
-  <ds:schemaRefs>
-    <ds:schemaRef ds:uri="http://schemas.microsoft.com/sharepoint/v3/contenttype/forms"/>
-  </ds:schemaRefs>
-</ds:datastoreItem>
+<file path=customXml/item2.xml><?xml version="1.0" encoding="utf-8"?>
+<b:Sources xmlns:b="http://schemas.openxmlformats.org/officeDocument/2006/bibliography" xmlns="http://schemas.openxmlformats.org/officeDocument/2006/bibliography" SelectedStyle="/APA.XSL" StyleName="APA"/>
 </file>
 
-<file path=customXml/itemProps2.xml><?xml version="1.0" encoding="utf-8"?>
-<ds:datastoreItem xmlns:ds="http://schemas.openxmlformats.org/officeDocument/2006/customXml" ds:itemID="{A7606A45-B25C-4FBA-BE17-306B7D23C091}">
-  <ds:schemaRefs>
-    <ds:schemaRef ds:uri="http://schemas.microsoft.com/office/2006/metadata/properties"/>
-    <ds:schemaRef ds:uri="http://schemas.microsoft.com/office/infopath/2007/PartnerControls"/>
-    <ds:schemaRef ds:uri="94d5cf59-5162-48bc-aa9b-620df72947f5"/>
-    <ds:schemaRef ds:uri="8350b7c0-334b-4e19-bfc1-744f6a979eee"/>
-  </ds:schemaRefs>
-</ds:datastoreItem>
+<file path=customXml/item3.xml><?xml version="1.0" encoding="utf-8"?>
+<p:properties xmlns:p="http://schemas.microsoft.com/office/2006/metadata/properties" xmlns:xsi="http://www.w3.org/2001/XMLSchema-instance" xmlns:pc="http://schemas.microsoft.com/office/infopath/2007/PartnerControls">
+  <documentManagement>
+    <lcf76f155ced4ddcb4097134ff3c332f xmlns="94d5cf59-5162-48bc-aa9b-620df72947f5">
+      <Terms xmlns="http://schemas.microsoft.com/office/infopath/2007/PartnerControls"/>
+    </lcf76f155ced4ddcb4097134ff3c332f>
+    <TaxCatchAll xmlns="8350b7c0-334b-4e19-bfc1-744f6a979eee" xsi:nil="true"/>
+  </documentManagement>
+</p:properties>
 </file>
 
-<file path=customXml/itemProps3.xml><?xml version="1.0" encoding="utf-8"?>
-<ds:datastoreItem xmlns:ds="http://schemas.openxmlformats.org/officeDocument/2006/customXml" ds:itemID="{EF278816-EC6F-A645-907D-7F25AECB1D4A}">
-  <ds:schemaRefs>
-    <ds:schemaRef ds:uri="http://schemas.openxmlformats.org/officeDocument/2006/bibliography"/>
-  </ds:schemaRefs>
-</ds:datastoreItem>
+<file path=customXml/item4.xml><?xml version="1.0" encoding="utf-8"?>
+<?mso-contentType ?>
+<FormTemplates xmlns="http://schemas.microsoft.com/sharepoint/v3/contenttype/forms">
+  <Display>DocumentLibraryForm</Display>
+  <Edit>DocumentLibraryForm</Edit>
+  <New>DocumentLibraryForm</New>
+</FormTemplates>
 </file>
 
-<file path=customXml/itemProps4.xml><?xml version="1.0" encoding="utf-8"?>
+<file path=customXml/itemProps1.xml><?xml version="1.0" encoding="utf-8"?>
 <ds:datastoreItem xmlns:ds="http://schemas.openxmlformats.org/officeDocument/2006/customXml" ds:itemID="{5B64FE0E-7912-4F95-AAFF-E0C8FB9265FD}">
   <ds:schemaRefs>
     <ds:schemaRef ds:uri="http://schemas.microsoft.com/office/2006/metadata/contentType"/>
@@ -19567,6 +19506,33 @@
 </ds:datastoreItem>
 </file>
 
+<file path=customXml/itemProps2.xml><?xml version="1.0" encoding="utf-8"?>
+<ds:datastoreItem xmlns:ds="http://schemas.openxmlformats.org/officeDocument/2006/customXml" ds:itemID="{EF278816-EC6F-A645-907D-7F25AECB1D4A}">
+  <ds:schemaRefs>
+    <ds:schemaRef ds:uri="http://schemas.openxmlformats.org/officeDocument/2006/bibliography"/>
+  </ds:schemaRefs>
+</ds:datastoreItem>
+</file>
+
+<file path=customXml/itemProps3.xml><?xml version="1.0" encoding="utf-8"?>
+<ds:datastoreItem xmlns:ds="http://schemas.openxmlformats.org/officeDocument/2006/customXml" ds:itemID="{A7606A45-B25C-4FBA-BE17-306B7D23C091}">
+  <ds:schemaRefs>
+    <ds:schemaRef ds:uri="http://schemas.microsoft.com/office/2006/metadata/properties"/>
+    <ds:schemaRef ds:uri="http://schemas.microsoft.com/office/infopath/2007/PartnerControls"/>
+    <ds:schemaRef ds:uri="94d5cf59-5162-48bc-aa9b-620df72947f5"/>
+    <ds:schemaRef ds:uri="8350b7c0-334b-4e19-bfc1-744f6a979eee"/>
+  </ds:schemaRefs>
+</ds:datastoreItem>
+</file>
+
+<file path=customXml/itemProps4.xml><?xml version="1.0" encoding="utf-8"?>
+<ds:datastoreItem xmlns:ds="http://schemas.openxmlformats.org/officeDocument/2006/customXml" ds:itemID="{360ECE8A-3139-463D-90B6-2A7471686095}">
+  <ds:schemaRefs>
+    <ds:schemaRef ds:uri="http://schemas.microsoft.com/sharepoint/v3/contenttype/forms"/>
+  </ds:schemaRefs>
+</ds:datastoreItem>
+</file>
+
 <file path=docMetadata/LabelInfo.xml><?xml version="1.0" encoding="utf-8"?>
 <clbl:labelList xmlns:clbl="http://schemas.microsoft.com/office/2020/mipLabelMetadata">
   <clbl:label id="{ccb6fc37-a1d1-4252-981c-63836d1ca50c}" enabled="1" method="Standard" siteId="{e0793d39-0939-496d-b129-198edd916feb}" removed="0"/>

</xml_diff>